<commit_message>
Fix: Handle potential null values in analysis results to prevent runtime errors
Replit-Commit-Author: Agent
Replit-Commit-Session-Id: b4bba866-f5e4-47c6-a742-dc43bb23f324
Replit-Commit-Screenshot-Url: https://storage.googleapis.com/screenshot-production-us-central1/b810333a-c333-40e9-99aa-261d8d6aa54d/8c43698a-9ffa-4eb6-a625-166759b2d702.jpg
</commit_message>
<xml_diff>
--- a/temp/2_ÑÐµÐºÑÑ Ñ Ð¾ÑÐ¸Ð±ÐºÐ°Ð¼Ð¸.docx
+++ b/temp/2_ÑÐµÐºÑÑ Ñ Ð¾ÑÐ¸Ð±ÐºÐ°Ð¼Ð¸.docx
@@ -3,38 +3,101 @@
 <w:document xmlns:wpc="http://schemas.microsoft.com/office/word/2010/wordprocessingCanvas" xmlns:cx="http://schemas.microsoft.com/office/drawing/2014/chartex" xmlns:cx1="http://schemas.microsoft.com/office/drawing/2015/9/8/chartex" xmlns:cx2="http://schemas.microsoft.com/office/drawing/2015/10/21/chartex" xmlns:cx3="http://schemas.microsoft.com/office/drawing/2016/5/9/chartex" xmlns:cx4="http://schemas.microsoft.com/office/drawing/2016/5/10/chartex" xmlns:cx5="http://schemas.microsoft.com/office/drawing/2016/5/11/chartex" xmlns:cx6="http://schemas.microsoft.com/office/drawing/2016/5/12/chartex" xmlns:cx7="http://schemas.microsoft.com/office/drawing/2016/5/13/chartex" xmlns:cx8="http://schemas.microsoft.com/office/drawing/2016/5/14/chartex" xmlns:mc="http://schemas.openxmlformats.org/markup-compatibility/2006" xmlns:aink="http://schemas.microsoft.com/office/drawing/2016/ink" xmlns:am3d="http://schemas.microsoft.com/office/drawing/2017/model3d" xmlns:o="urn:schemas-microsoft-com:office:office" xmlns:r="http://schemas.openxmlformats.org/officeDocument/2006/relationships" xmlns:m="http://schemas.openxmlformats.org/officeDocument/2006/math" xmlns:v="urn:schemas-microsoft-com:vml" xmlns:wp14="http://schemas.microsoft.com/office/word/2010/wordprocessingDrawing" xmlns:wp="http://schemas.openxmlformats.org/drawingml/2006/wordprocessingDrawing" xmlns:w10="urn:schemas-microsoft-com:office:word" xmlns:w="http://schemas.openxmlformats.org/wordprocessingml/2006/main" xmlns:w14="http://schemas.microsoft.com/office/word/2010/wordml" xmlns:w15="http://schemas.microsoft.com/office/word/2012/wordml" xmlns:w16cex="http://schemas.microsoft.com/office/word/2018/wordml/cex" xmlns:w16cid="http://schemas.microsoft.com/office/word/2016/wordml/cid" xmlns:w16="http://schemas.microsoft.com/office/word/2018/wordml" xmlns:w16sdtdh="http://schemas.microsoft.com/office/word/2020/wordml/sdtdatahash" xmlns:w16se="http://schemas.microsoft.com/office/word/2015/wordml/symex" xmlns:wpg="http://schemas.microsoft.com/office/word/2010/wordprocessingGroup" xmlns:wpi="http://schemas.microsoft.com/office/word/2010/wordprocessingInk" xmlns:wne="http://schemas.microsoft.com/office/word/2006/wordml" xmlns:wps="http://schemas.microsoft.com/office/word/2010/wordprocessingShape" mc:Ignorable="w14 w15 w16se w16cid w16 w16cex w16sdtdh wp14">
   <w:body>
     <w:p>
-      <w:proofErr w:type="spellStart"/>
-      <w:r>
+      <w:pPr>
+        <w:rPr>
+          <w:sz w:val="28"/>
+          <w:szCs w:val="28"/>
+        </w:rPr>
+      </w:pPr>
+      <w:proofErr w:type="spellStart"/>
+      <w:r>
+        <w:rPr>
+          <w:sz w:val="28"/>
+          <w:szCs w:val="28"/>
+        </w:rPr>
         <w:t>Превед</w:t>
       </w:r>
       <w:proofErr w:type="spellEnd"/>
       <w:r>
+        <w:rPr>
+          <w:sz w:val="28"/>
+          <w:szCs w:val="28"/>
+        </w:rPr>
         <w:t xml:space="preserve">. </w:t>
       </w:r>
       <w:proofErr w:type="spellStart"/>
       <w:r>
+        <w:rPr>
+          <w:sz w:val="28"/>
+          <w:szCs w:val="28"/>
+        </w:rPr>
         <w:t>Ккак</w:t>
       </w:r>
       <w:proofErr w:type="spellEnd"/>
       <w:r>
+        <w:rPr>
+          <w:sz w:val="28"/>
+          <w:szCs w:val="28"/>
+        </w:rPr>
         <w:t xml:space="preserve"> </w:t>
       </w:r>
       <w:proofErr w:type="spellStart"/>
       <w:r>
+        <w:rPr>
+          <w:sz w:val="28"/>
+          <w:szCs w:val="28"/>
+        </w:rPr>
         <w:t>дила</w:t>
       </w:r>
       <w:proofErr w:type="spellEnd"/>
       <w:r>
-        <w:t xml:space="preserve">? У мене всё нормальна , </w:t>
-      </w:r>
-      <w:proofErr w:type="spellStart"/>
-      <w:r>
+        <w:rPr>
+          <w:sz w:val="28"/>
+          <w:szCs w:val="28"/>
+        </w:rPr>
+        <w:t xml:space="preserve">? У мене всё </w:t>
+      </w:r>
+      <w:proofErr w:type="gramStart"/>
+      <w:r>
+        <w:rPr>
+          <w:sz w:val="28"/>
+          <w:szCs w:val="28"/>
+        </w:rPr>
+        <w:t>нормальна ,</w:t>
+      </w:r>
+      <w:proofErr w:type="gramEnd"/>
+      <w:r>
+        <w:rPr>
+          <w:sz w:val="28"/>
+          <w:szCs w:val="28"/>
+        </w:rPr>
+        <w:t xml:space="preserve"> </w:t>
+      </w:r>
+      <w:proofErr w:type="spellStart"/>
+      <w:r>
+        <w:rPr>
+          <w:sz w:val="28"/>
+          <w:szCs w:val="28"/>
+        </w:rPr>
         <w:t>малоко</w:t>
       </w:r>
       <w:proofErr w:type="spellEnd"/>
     </w:p>
-    <w:p/>
     <w:p>
+      <w:pPr>
+        <w:rPr>
+          <w:sz w:val="28"/>
+          <w:szCs w:val="28"/>
+        </w:rPr>
+      </w:pPr>
+    </w:p>
+    <w:p>
+      <w:pPr>
+        <w:rPr>
+          <w:sz w:val="28"/>
+          <w:szCs w:val="28"/>
+        </w:rPr>
+      </w:pPr>
       <w:r>
         <w:rPr>
           <w:color w:val="000000"/>

</xml_diff>